<commit_message>
CV JMP abstract revision
</commit_message>
<xml_diff>
--- a/assets/nag/cv.docx
+++ b/assets/nag/cv.docx
@@ -955,32 +955,72 @@
                 <w:sz w:val="22"/>
                 <w:szCs w:val="22"/>
               </w:rPr>
-              <w:t xml:space="preserve">Abstract: </w:t>
-            </w:r>
-            <w:r>
-              <w:rPr>
-                <w:rFonts w:ascii="Cambria" w:hAnsi="Cambria" w:cs="Times New Roman"/>
-                <w:sz w:val="22"/>
-                <w:szCs w:val="22"/>
-              </w:rPr>
-              <w:t xml:space="preserve">The US spends $48 billion on federal rental assistance programs that transfer large in-kind housing subsidies to few </w:t>
-            </w:r>
-            <w:r>
-              <w:rPr>
-                <w:rFonts w:ascii="Cambria" w:hAnsi="Cambria" w:cs="Times New Roman"/>
-                <w:sz w:val="22"/>
-                <w:szCs w:val="22"/>
-              </w:rPr>
-              <w:t>low-income</w:t>
-            </w:r>
-            <w:r>
-              <w:rPr>
-                <w:rFonts w:ascii="Cambria" w:hAnsi="Cambria" w:cs="Times New Roman"/>
-                <w:sz w:val="22"/>
-                <w:szCs w:val="22"/>
-              </w:rPr>
-              <w:t xml:space="preserve"> households. However, we know little about whether this form of targeting is efficient. In this paper, I reconceptualize federal rental assistance as insurance against joint rent-income risk and quantify its net insurance value. I show that rent prices exacerbate consumption risk beyond income risk alone, and that rental assistance provides targeted insurance by smoothing the share of income households pay as rent. Using Panel Survey of Income Dynamics (PSID) combined with rich HUD administrative data from 2003-2022, I estimate the insurance value use the sufficient statistics approach. The sufficient statistics framework reveals that marginal expansion of rental assistance generates $1.51 in benefits per dollar of government spending, compared to the literature’s estimate of $0.66. This insurance value primarily derives from insuring income in high-rent locations rather than insuring rent volatility directly, although fixed income households benefit more from rent insurance. Using a structural lifecycle model, I provide new estimates of household preferences for rental assistance and examine the mechanisms behind its insurance value. Counterfactual analysis demonstrates that the program’s income-based subsidy design and rationing through waitlists are crucial features that enhance its insurance value relative to alternative designs.</w:t>
-            </w:r>
+              <w:t>Abstract:</w:t>
+            </w:r>
+            <w:r>
+              <w:rPr>
+                <w:rFonts w:ascii="Cambria" w:hAnsi="Cambria" w:cs="Times New Roman"/>
+                <w:i/>
+                <w:iCs/>
+                <w:sz w:val="22"/>
+                <w:szCs w:val="22"/>
+              </w:rPr>
+              <w:t xml:space="preserve"> </w:t>
+            </w:r>
+            <w:r>
+              <w:rPr>
+                <w:rFonts w:ascii="Cambria" w:hAnsi="Cambria" w:cs="Times New Roman"/>
+                <w:sz w:val="22"/>
+                <w:szCs w:val="22"/>
+              </w:rPr>
+              <w:t xml:space="preserve">Each year, the U.S. federal government spends $48 billion providing large rental subsidies to a relatively small share of low-income households, many of whom wait years to receive assistance. Unlike other safety net programs, rental assistance uniquely subsidizes households when area rents rise or when household income falls, smoothing the share of income spent on rent. Motivated by this design and the high fixed costs of adjusting housing consumption, I conceptualize federal rental assistance as insurance against joint rent-income risk. To analyze this risk, I use the Panel Survey of Income Dynamics (PSID) and rich HUD administrative data, showing that rents exacerbate consumption risk beyond income risk alone. I quantify how rental assistance </w:t>
+            </w:r>
+            <w:proofErr w:type="gramStart"/>
+            <w:r>
+              <w:rPr>
+                <w:rFonts w:ascii="Cambria" w:hAnsi="Cambria" w:cs="Times New Roman"/>
+                <w:sz w:val="22"/>
+                <w:szCs w:val="22"/>
+              </w:rPr>
+              <w:t>insures</w:t>
+            </w:r>
+            <w:proofErr w:type="gramEnd"/>
+            <w:r>
+              <w:rPr>
+                <w:rFonts w:ascii="Cambria" w:hAnsi="Cambria" w:cs="Times New Roman"/>
+                <w:sz w:val="22"/>
+                <w:szCs w:val="22"/>
+              </w:rPr>
+              <w:t xml:space="preserve"> this </w:t>
+            </w:r>
+            <w:proofErr w:type="gramStart"/>
+            <w:r>
+              <w:rPr>
+                <w:rFonts w:ascii="Cambria" w:hAnsi="Cambria" w:cs="Times New Roman"/>
+                <w:sz w:val="22"/>
+                <w:szCs w:val="22"/>
+              </w:rPr>
+              <w:t>particular consumption</w:t>
+            </w:r>
+            <w:proofErr w:type="gramEnd"/>
+            <w:r>
+              <w:rPr>
+                <w:rFonts w:ascii="Cambria" w:hAnsi="Cambria" w:cs="Times New Roman"/>
+                <w:sz w:val="22"/>
+                <w:szCs w:val="22"/>
+              </w:rPr>
+              <w:t xml:space="preserve"> risk using a sufficient statistics framework, finding that rental assistance generates $1.51 in benefits per dollar of government spending, significantly larger than the previous literature’s estimate of $0.66. I attribute this large insurance value to insuring rent volatility for fixed-income households and insuring income in high-rent locations. Using a structural lifecycle model, I conduct counterfactual analysis that demonstrates that the program’s dynamic subsidy design and rationing through waitlists are crucial features that enhance its insurance value.</w:t>
+            </w:r>
+          </w:p>
+          <w:p>
+            <w:pPr>
+              <w:jc w:val="both"/>
+              <w:rPr>
+                <w:rFonts w:ascii="Cambria" w:hAnsi="Cambria" w:cs="Times New Roman"/>
+                <w:sz w:val="22"/>
+                <w:szCs w:val="22"/>
+              </w:rPr>
+            </w:pPr>
           </w:p>
           <w:p>
             <w:pPr>
@@ -1849,16 +1889,7 @@
                 <w:sz w:val="22"/>
                 <w:szCs w:val="22"/>
               </w:rPr>
-              <w:t xml:space="preserve"> </w:t>
-            </w:r>
-            <w:r>
-              <w:rPr>
-                <w:rFonts w:ascii="Cambria" w:hAnsi="Cambria" w:cs="Times New Roman"/>
-                <w:color w:val="000000" w:themeColor="text1"/>
-                <w:sz w:val="22"/>
-                <w:szCs w:val="22"/>
-              </w:rPr>
-              <w:t xml:space="preserve">Private equity (PE) investment in the U.S. healthcare sector has grown exponentially, raising concerns about its impact on the cost and quality of care. This paper investigates how PE acquisitions alter the behavior of primary care practices (PCPs) and, crucially, explores heterogeneity based on the acquirer's structure. We distinguish between acquisitions by pure financial sponsors and those by PE-insurer joint ventures, which may face conflicting incentives between profit maximization and managing population health costs. We construct a novel national dataset by linking </w:t>
+              <w:t xml:space="preserve"> Private equity (PE) investment in the U.S. healthcare sector has grown exponentially, raising concerns about its impact on the cost and quality of care. This paper investigates how PE acquisitions alter the behavior of primary care practices (PCPs) and, crucially, explores heterogeneity based on the acquirer's structure. We distinguish between acquisitions by pure financial sponsors and those by PE-insurer joint ventures, which may face conflicting incentives between profit maximization and managing population health costs. We construct a novel national dataset by linking </w:t>
             </w:r>
             <w:proofErr w:type="spellStart"/>
             <w:r>
@@ -3474,7 +3505,6 @@
   <w:style w:type="character" w:default="1" w:styleId="DefaultParagraphFont">
     <w:name w:val="Default Paragraph Font"/>
     <w:uiPriority w:val="1"/>
-    <w:semiHidden/>
     <w:unhideWhenUsed/>
   </w:style>
   <w:style w:type="table" w:default="1" w:styleId="TableNormal">

</xml_diff>